<commit_message>
fix: address Phase 5 review
environment.yml lists the bioconda and gurobi channels of PyPSA-Earth's lock file and pins the new packages (dry-run solve passes). Report and deck carry the author's metadata and read every result number from results/*.csv or the register, with asserts where the text states a result. dispatch_by_carrier raises on carriers without a colour; price duration x axis uses snapshot weightings; system-cost figure notes that only differences matter; flexibility wording corrected; README layout updated.
</commit_message>
<xml_diff>
--- a/report/report.docx
+++ b/report/report.docx
@@ -20,7 +20,7 @@
         <w:rPr>
           <w:sz w:val="18"/>
         </w:rPr>
-        <w:t>Model: PyPSA-Earth v0.10.0 with the study code in this repository. All result numbers come from results/summary.csv and results/avoided.csv; all inputs come from data/assumptions_register.xlsx.</w:t>
+        <w:t>Model: PyPSA-Earth v0.10.0 with the study code in this repository. All result numbers come from results/summary.csv, results/avoided.csv and results/validation.csv; all inputs come from data/assumptions_register.xlsx.</w:t>
       </w:r>
     </w:p>
     <w:p>
@@ -242,7 +242,7 @@
         <w:pStyle w:val="ListBullet"/>
       </w:pPr>
       <w:r>
-        <w:t>At the base gas price the least-cost system reaches 56% renewables, so the 35% target does not bind. It binds only when gas costs half as much.</w:t>
+        <w:t>At the base gas price the least-cost system reaches 56% renewables, so the 35% target does not bind. It binds only in G-lo-S0, G-lo-S1-15.</w:t>
       </w:r>
     </w:p>
     <w:p>
@@ -928,7 +928,7 @@
     <w:p/>
     <w:p>
       <w:r>
-        <w:t>Shiftable load is modelled as a free, lossless store at each node that starts and ends every day half full. Load can be brought forward or postponed, but every MWh moved must come back within 3 hours, and only one direction is allowed in each hour.</w:t>
+        <w:t>Shiftable load is modelled as a free, lossless store at each node that starts and ends every day half full. Load can be brought forward or postponed, but every MWh moved must come back within 3 hours, and the load moved up plus the load moved down in one hour cannot exceed the shift limit.</w:t>
       </w:r>
     </w:p>
     <w:p>
@@ -3520,7 +3520,7 @@
         <w:pStyle w:val="ListBullet"/>
       </w:pPr>
       <w:r>
-        <w:t>One weather year (2013) at 1-hour steps. A 3-hour test run built 2.7% more solar and 3.9% more wind.</w:t>
+        <w:t>One weather year (2013) at 1-hour steps. A 3-hour test run built 2.7% more solar and 3.9% more wind (resolution benchmark in docs/phase2-base-network.md).</w:t>
       </w:r>
     </w:p>
     <w:p>

</xml_diff>

<commit_message>
docs: regenerate report and slides; point the skill at the new paths
</commit_message>
<xml_diff>
--- a/report/report.docx
+++ b/report/report.docx
@@ -3520,7 +3520,7 @@
         <w:pStyle w:val="ListBullet"/>
       </w:pPr>
       <w:r>
-        <w:t>One weather year (2013) at 1-hour steps. A 3-hour test run built 2.7% more solar and 3.9% more wind (resolution benchmark in docs/phase2-base-network.md).</w:t>
+        <w:t>One weather year (2013) at 1-hour steps. A 3-hour test run built 2.7% more solar and 3.9% more wind (resolution benchmark in docs/project-history/phase2-base-network.md).</w:t>
       </w:r>
     </w:p>
     <w:p>
@@ -7076,6 +7076,796 @@
                 <w:sz w:val="18"/>
               </w:rPr>
               <w:t>JICA / TEPSCO / KPMG, Data Collection Survey on Power Sector in Tunisia, Final Report (Mar 2022), p.5-33</w:t>
+            </w:r>
+          </w:p>
+        </w:tc>
+      </w:tr>
+      <w:tr>
+        <w:tc>
+          <w:tcPr>
+            <w:tcW w:type="dxa" w:w="2381"/>
+          </w:tcPr>
+          <w:p>
+            <w:r>
+              <w:rPr>
+                <w:sz w:val="18"/>
+              </w:rPr>
+              <w:t>gas_supply_domestic_2024_ktep</w:t>
+            </w:r>
+          </w:p>
+        </w:tc>
+        <w:tc>
+          <w:tcPr>
+            <w:tcW w:type="dxa" w:w="1020"/>
+          </w:tcPr>
+          <w:p>
+            <w:pPr>
+              <w:jc w:val="right"/>
+            </w:pPr>
+            <w:r>
+              <w:rPr>
+                <w:sz w:val="18"/>
+              </w:rPr>
+              <w:t>1,212</w:t>
+            </w:r>
+          </w:p>
+        </w:tc>
+        <w:tc>
+          <w:tcPr>
+            <w:tcW w:type="dxa" w:w="1134"/>
+          </w:tcPr>
+          <w:p>
+            <w:pPr>
+              <w:jc w:val="right"/>
+            </w:pPr>
+            <w:r>
+              <w:rPr>
+                <w:sz w:val="18"/>
+              </w:rPr>
+              <w:t>ktep (net CV)</w:t>
+            </w:r>
+          </w:p>
+        </w:tc>
+        <w:tc>
+          <w:tcPr>
+            <w:tcW w:type="dxa" w:w="1020"/>
+          </w:tcPr>
+          <w:p>
+            <w:pPr>
+              <w:jc w:val="right"/>
+            </w:pPr>
+            <w:r>
+              <w:rPr>
+                <w:sz w:val="18"/>
+              </w:rPr>
+              <w:t>sourced</w:t>
+            </w:r>
+          </w:p>
+        </w:tc>
+        <w:tc>
+          <w:tcPr>
+            <w:tcW w:type="dxa" w:w="3742"/>
+          </w:tcPr>
+          <w:p>
+            <w:pPr>
+              <w:jc w:val="right"/>
+            </w:pPr>
+            <w:r>
+              <w:rPr>
+                <w:sz w:val="18"/>
+              </w:rPr>
+              <w:t>ONEM / Ministry of Industry, Mines and Energy, Memento du secteur de l'énergie, Chiffres de 2024 (Aug 2025), table 'Gaz naturel' (approvisionnement, ktep-pci)</w:t>
+            </w:r>
+          </w:p>
+        </w:tc>
+      </w:tr>
+      <w:tr>
+        <w:tc>
+          <w:tcPr>
+            <w:tcW w:type="dxa" w:w="2381"/>
+          </w:tcPr>
+          <w:p>
+            <w:r>
+              <w:rPr>
+                <w:sz w:val="18"/>
+              </w:rPr>
+              <w:t>gas_supply_royalty_2024_ktep</w:t>
+            </w:r>
+          </w:p>
+        </w:tc>
+        <w:tc>
+          <w:tcPr>
+            <w:tcW w:type="dxa" w:w="1020"/>
+          </w:tcPr>
+          <w:p>
+            <w:pPr>
+              <w:jc w:val="right"/>
+            </w:pPr>
+            <w:r>
+              <w:rPr>
+                <w:sz w:val="18"/>
+              </w:rPr>
+              <w:t>909</w:t>
+            </w:r>
+          </w:p>
+        </w:tc>
+        <w:tc>
+          <w:tcPr>
+            <w:tcW w:type="dxa" w:w="1134"/>
+          </w:tcPr>
+          <w:p>
+            <w:pPr>
+              <w:jc w:val="right"/>
+            </w:pPr>
+            <w:r>
+              <w:rPr>
+                <w:sz w:val="18"/>
+              </w:rPr>
+              <w:t>ktep (net CV)</w:t>
+            </w:r>
+          </w:p>
+        </w:tc>
+        <w:tc>
+          <w:tcPr>
+            <w:tcW w:type="dxa" w:w="1020"/>
+          </w:tcPr>
+          <w:p>
+            <w:pPr>
+              <w:jc w:val="right"/>
+            </w:pPr>
+            <w:r>
+              <w:rPr>
+                <w:sz w:val="18"/>
+              </w:rPr>
+              <w:t>sourced</w:t>
+            </w:r>
+          </w:p>
+        </w:tc>
+        <w:tc>
+          <w:tcPr>
+            <w:tcW w:type="dxa" w:w="3742"/>
+          </w:tcPr>
+          <w:p>
+            <w:pPr>
+              <w:jc w:val="right"/>
+            </w:pPr>
+            <w:r>
+              <w:rPr>
+                <w:sz w:val="18"/>
+              </w:rPr>
+              <w:t>ONEM / Ministry of Industry, Mines and Energy, Memento du secteur de l'énergie, Chiffres de 2024 (Aug 2025), table 'Gaz naturel' (approvisionnement, ktep-pci)</w:t>
+            </w:r>
+          </w:p>
+        </w:tc>
+      </w:tr>
+      <w:tr>
+        <w:tc>
+          <w:tcPr>
+            <w:tcW w:type="dxa" w:w="2381"/>
+          </w:tcPr>
+          <w:p>
+            <w:r>
+              <w:rPr>
+                <w:sz w:val="18"/>
+              </w:rPr>
+              <w:t>gas_supply_purchases_2024_ktep</w:t>
+            </w:r>
+          </w:p>
+        </w:tc>
+        <w:tc>
+          <w:tcPr>
+            <w:tcW w:type="dxa" w:w="1020"/>
+          </w:tcPr>
+          <w:p>
+            <w:pPr>
+              <w:jc w:val="right"/>
+            </w:pPr>
+            <w:r>
+              <w:rPr>
+                <w:sz w:val="18"/>
+              </w:rPr>
+              <w:t>2,290</w:t>
+            </w:r>
+          </w:p>
+        </w:tc>
+        <w:tc>
+          <w:tcPr>
+            <w:tcW w:type="dxa" w:w="1134"/>
+          </w:tcPr>
+          <w:p>
+            <w:pPr>
+              <w:jc w:val="right"/>
+            </w:pPr>
+            <w:r>
+              <w:rPr>
+                <w:sz w:val="18"/>
+              </w:rPr>
+              <w:t>ktep (net CV)</w:t>
+            </w:r>
+          </w:p>
+        </w:tc>
+        <w:tc>
+          <w:tcPr>
+            <w:tcW w:type="dxa" w:w="1020"/>
+          </w:tcPr>
+          <w:p>
+            <w:pPr>
+              <w:jc w:val="right"/>
+            </w:pPr>
+            <w:r>
+              <w:rPr>
+                <w:sz w:val="18"/>
+              </w:rPr>
+              <w:t>sourced</w:t>
+            </w:r>
+          </w:p>
+        </w:tc>
+        <w:tc>
+          <w:tcPr>
+            <w:tcW w:type="dxa" w:w="3742"/>
+          </w:tcPr>
+          <w:p>
+            <w:pPr>
+              <w:jc w:val="right"/>
+            </w:pPr>
+            <w:r>
+              <w:rPr>
+                <w:sz w:val="18"/>
+              </w:rPr>
+              <w:t>ONEM / Ministry of Industry, Mines and Energy, Memento du secteur de l'énergie, Chiffres de 2024 (Aug 2025), table 'Gaz naturel' (approvisionnement, ktep-pci)</w:t>
+            </w:r>
+          </w:p>
+        </w:tc>
+      </w:tr>
+      <w:tr>
+        <w:tc>
+          <w:tcPr>
+            <w:tcW w:type="dxa" w:w="2381"/>
+          </w:tcPr>
+          <w:p>
+            <w:r>
+              <w:rPr>
+                <w:sz w:val="18"/>
+              </w:rPr>
+              <w:t>energy_independence_2024</w:t>
+            </w:r>
+          </w:p>
+        </w:tc>
+        <w:tc>
+          <w:tcPr>
+            <w:tcW w:type="dxa" w:w="1020"/>
+          </w:tcPr>
+          <w:p>
+            <w:pPr>
+              <w:jc w:val="right"/>
+            </w:pPr>
+            <w:r>
+              <w:rPr>
+                <w:sz w:val="18"/>
+              </w:rPr>
+              <w:t>0.41</w:t>
+            </w:r>
+          </w:p>
+        </w:tc>
+        <w:tc>
+          <w:tcPr>
+            <w:tcW w:type="dxa" w:w="1134"/>
+          </w:tcPr>
+          <w:p>
+            <w:pPr>
+              <w:jc w:val="right"/>
+            </w:pPr>
+            <w:r>
+              <w:rPr>
+                <w:sz w:val="18"/>
+              </w:rPr>
+              <w:t>share</w:t>
+            </w:r>
+          </w:p>
+        </w:tc>
+        <w:tc>
+          <w:tcPr>
+            <w:tcW w:type="dxa" w:w="1020"/>
+          </w:tcPr>
+          <w:p>
+            <w:pPr>
+              <w:jc w:val="right"/>
+            </w:pPr>
+            <w:r>
+              <w:rPr>
+                <w:sz w:val="18"/>
+              </w:rPr>
+              <w:t>sourced</w:t>
+            </w:r>
+          </w:p>
+        </w:tc>
+        <w:tc>
+          <w:tcPr>
+            <w:tcW w:type="dxa" w:w="3742"/>
+          </w:tcPr>
+          <w:p>
+            <w:pPr>
+              <w:jc w:val="right"/>
+            </w:pPr>
+            <w:r>
+              <w:rPr>
+                <w:sz w:val="18"/>
+              </w:rPr>
+              <w:t>ONEM / Ministry of Industry, Mines and Energy, Memento du secteur de l'énergie, Chiffres de 2024 (Aug 2025), 'Bilan d'énergie primaire'</w:t>
+            </w:r>
+          </w:p>
+        </w:tc>
+      </w:tr>
+      <w:tr>
+        <w:tc>
+          <w:tcPr>
+            <w:tcW w:type="dxa" w:w="2381"/>
+          </w:tcPr>
+          <w:p>
+            <w:r>
+              <w:rPr>
+                <w:sz w:val="18"/>
+              </w:rPr>
+              <w:t>steg_established_year</w:t>
+            </w:r>
+          </w:p>
+        </w:tc>
+        <w:tc>
+          <w:tcPr>
+            <w:tcW w:type="dxa" w:w="1020"/>
+          </w:tcPr>
+          <w:p>
+            <w:pPr>
+              <w:jc w:val="right"/>
+            </w:pPr>
+            <w:r>
+              <w:rPr>
+                <w:sz w:val="18"/>
+              </w:rPr>
+              <w:t>1,962</w:t>
+            </w:r>
+          </w:p>
+        </w:tc>
+        <w:tc>
+          <w:tcPr>
+            <w:tcW w:type="dxa" w:w="1134"/>
+          </w:tcPr>
+          <w:p>
+            <w:pPr>
+              <w:jc w:val="right"/>
+            </w:pPr>
+            <w:r>
+              <w:rPr>
+                <w:sz w:val="18"/>
+              </w:rPr>
+              <w:t>year</w:t>
+            </w:r>
+          </w:p>
+        </w:tc>
+        <w:tc>
+          <w:tcPr>
+            <w:tcW w:type="dxa" w:w="1020"/>
+          </w:tcPr>
+          <w:p>
+            <w:pPr>
+              <w:jc w:val="right"/>
+            </w:pPr>
+            <w:r>
+              <w:rPr>
+                <w:sz w:val="18"/>
+              </w:rPr>
+              <w:t>sourced</w:t>
+            </w:r>
+          </w:p>
+        </w:tc>
+        <w:tc>
+          <w:tcPr>
+            <w:tcW w:type="dxa" w:w="3742"/>
+          </w:tcPr>
+          <w:p>
+            <w:pPr>
+              <w:jc w:val="right"/>
+            </w:pPr>
+            <w:r>
+              <w:rPr>
+                <w:sz w:val="18"/>
+              </w:rPr>
+              <w:t>JICA / TEPSCO / KPMG, Data Collection Survey on Power Sector in Tunisia, Final Report (Mar 2022), p.2-1</w:t>
+            </w:r>
+          </w:p>
+        </w:tc>
+      </w:tr>
+      <w:tr>
+        <w:tc>
+          <w:tcPr>
+            <w:tcW w:type="dxa" w:w="2381"/>
+          </w:tcPr>
+          <w:p>
+            <w:r>
+              <w:rPr>
+                <w:sz w:val="18"/>
+              </w:rPr>
+              <w:t>steg_generation_share</w:t>
+            </w:r>
+          </w:p>
+        </w:tc>
+        <w:tc>
+          <w:tcPr>
+            <w:tcW w:type="dxa" w:w="1020"/>
+          </w:tcPr>
+          <w:p>
+            <w:pPr>
+              <w:jc w:val="right"/>
+            </w:pPr>
+            <w:r>
+              <w:rPr>
+                <w:sz w:val="18"/>
+              </w:rPr>
+              <w:t>0.86</w:t>
+            </w:r>
+          </w:p>
+        </w:tc>
+        <w:tc>
+          <w:tcPr>
+            <w:tcW w:type="dxa" w:w="1134"/>
+          </w:tcPr>
+          <w:p>
+            <w:pPr>
+              <w:jc w:val="right"/>
+            </w:pPr>
+            <w:r>
+              <w:rPr>
+                <w:sz w:val="18"/>
+              </w:rPr>
+              <w:t>share</w:t>
+            </w:r>
+          </w:p>
+        </w:tc>
+        <w:tc>
+          <w:tcPr>
+            <w:tcW w:type="dxa" w:w="1020"/>
+          </w:tcPr>
+          <w:p>
+            <w:pPr>
+              <w:jc w:val="right"/>
+            </w:pPr>
+            <w:r>
+              <w:rPr>
+                <w:sz w:val="18"/>
+              </w:rPr>
+              <w:t>sourced</w:t>
+            </w:r>
+          </w:p>
+        </w:tc>
+        <w:tc>
+          <w:tcPr>
+            <w:tcW w:type="dxa" w:w="3742"/>
+          </w:tcPr>
+          <w:p>
+            <w:pPr>
+              <w:jc w:val="right"/>
+            </w:pPr>
+            <w:r>
+              <w:rPr>
+                <w:sz w:val="18"/>
+              </w:rPr>
+              <w:t>JICA / TEPSCO / KPMG, Data Collection Survey on Power Sector in Tunisia, Final Report (Mar 2022), p.2-1</w:t>
+            </w:r>
+          </w:p>
+        </w:tc>
+      </w:tr>
+      <w:tr>
+        <w:tc>
+          <w:tcPr>
+            <w:tcW w:type="dxa" w:w="2381"/>
+          </w:tcPr>
+          <w:p>
+            <w:r>
+              <w:rPr>
+                <w:sz w:val="18"/>
+              </w:rPr>
+              <w:t>anme_established_year</w:t>
+            </w:r>
+          </w:p>
+        </w:tc>
+        <w:tc>
+          <w:tcPr>
+            <w:tcW w:type="dxa" w:w="1020"/>
+          </w:tcPr>
+          <w:p>
+            <w:pPr>
+              <w:jc w:val="right"/>
+            </w:pPr>
+            <w:r>
+              <w:rPr>
+                <w:sz w:val="18"/>
+              </w:rPr>
+              <w:t>1,985</w:t>
+            </w:r>
+          </w:p>
+        </w:tc>
+        <w:tc>
+          <w:tcPr>
+            <w:tcW w:type="dxa" w:w="1134"/>
+          </w:tcPr>
+          <w:p>
+            <w:pPr>
+              <w:jc w:val="right"/>
+            </w:pPr>
+            <w:r>
+              <w:rPr>
+                <w:sz w:val="18"/>
+              </w:rPr>
+              <w:t>year</w:t>
+            </w:r>
+          </w:p>
+        </w:tc>
+        <w:tc>
+          <w:tcPr>
+            <w:tcW w:type="dxa" w:w="1020"/>
+          </w:tcPr>
+          <w:p>
+            <w:pPr>
+              <w:jc w:val="right"/>
+            </w:pPr>
+            <w:r>
+              <w:rPr>
+                <w:sz w:val="18"/>
+              </w:rPr>
+              <w:t>sourced</w:t>
+            </w:r>
+          </w:p>
+        </w:tc>
+        <w:tc>
+          <w:tcPr>
+            <w:tcW w:type="dxa" w:w="3742"/>
+          </w:tcPr>
+          <w:p>
+            <w:pPr>
+              <w:jc w:val="right"/>
+            </w:pPr>
+            <w:r>
+              <w:rPr>
+                <w:sz w:val="18"/>
+              </w:rPr>
+              <w:t>JICA / TEPSCO / KPMG, Data Collection Survey on Power Sector in Tunisia, Final Report (Mar 2022), p.2-1</w:t>
+            </w:r>
+          </w:p>
+        </w:tc>
+      </w:tr>
+      <w:tr>
+        <w:tc>
+          <w:tcPr>
+            <w:tcW w:type="dxa" w:w="2381"/>
+          </w:tcPr>
+          <w:p>
+            <w:r>
+              <w:rPr>
+                <w:sz w:val="18"/>
+              </w:rPr>
+              <w:t>tsp_re_target_2030</w:t>
+            </w:r>
+          </w:p>
+        </w:tc>
+        <w:tc>
+          <w:tcPr>
+            <w:tcW w:type="dxa" w:w="1020"/>
+          </w:tcPr>
+          <w:p>
+            <w:pPr>
+              <w:jc w:val="right"/>
+            </w:pPr>
+            <w:r>
+              <w:rPr>
+                <w:sz w:val="18"/>
+              </w:rPr>
+              <w:t>0.3</w:t>
+            </w:r>
+          </w:p>
+        </w:tc>
+        <w:tc>
+          <w:tcPr>
+            <w:tcW w:type="dxa" w:w="1134"/>
+          </w:tcPr>
+          <w:p>
+            <w:pPr>
+              <w:jc w:val="right"/>
+            </w:pPr>
+            <w:r>
+              <w:rPr>
+                <w:sz w:val="18"/>
+              </w:rPr>
+              <w:t>share</w:t>
+            </w:r>
+          </w:p>
+        </w:tc>
+        <w:tc>
+          <w:tcPr>
+            <w:tcW w:type="dxa" w:w="1020"/>
+          </w:tcPr>
+          <w:p>
+            <w:pPr>
+              <w:jc w:val="right"/>
+            </w:pPr>
+            <w:r>
+              <w:rPr>
+                <w:sz w:val="18"/>
+              </w:rPr>
+              <w:t>sourced</w:t>
+            </w:r>
+          </w:p>
+        </w:tc>
+        <w:tc>
+          <w:tcPr>
+            <w:tcW w:type="dxa" w:w="3742"/>
+          </w:tcPr>
+          <w:p>
+            <w:pPr>
+              <w:jc w:val="right"/>
+            </w:pPr>
+            <w:r>
+              <w:rPr>
+                <w:sz w:val="18"/>
+              </w:rPr>
+              <w:t>JICA / TEPSCO / KPMG, Data Collection Survey on Power Sector in Tunisia, Final Report (Mar 2022), p.2-2</w:t>
+            </w:r>
+          </w:p>
+        </w:tc>
+      </w:tr>
+      <w:tr>
+        <w:tc>
+          <w:tcPr>
+            <w:tcW w:type="dxa" w:w="2381"/>
+          </w:tcPr>
+          <w:p>
+            <w:r>
+              <w:rPr>
+                <w:sz w:val="18"/>
+              </w:rPr>
+              <w:t>indc_co2_intensity_cut_2030</w:t>
+            </w:r>
+          </w:p>
+        </w:tc>
+        <w:tc>
+          <w:tcPr>
+            <w:tcW w:type="dxa" w:w="1020"/>
+          </w:tcPr>
+          <w:p>
+            <w:pPr>
+              <w:jc w:val="right"/>
+            </w:pPr>
+            <w:r>
+              <w:rPr>
+                <w:sz w:val="18"/>
+              </w:rPr>
+              <w:t>0.41</w:t>
+            </w:r>
+          </w:p>
+        </w:tc>
+        <w:tc>
+          <w:tcPr>
+            <w:tcW w:type="dxa" w:w="1134"/>
+          </w:tcPr>
+          <w:p>
+            <w:pPr>
+              <w:jc w:val="right"/>
+            </w:pPr>
+            <w:r>
+              <w:rPr>
+                <w:sz w:val="18"/>
+              </w:rPr>
+              <w:t>share</w:t>
+            </w:r>
+          </w:p>
+        </w:tc>
+        <w:tc>
+          <w:tcPr>
+            <w:tcW w:type="dxa" w:w="1020"/>
+          </w:tcPr>
+          <w:p>
+            <w:pPr>
+              <w:jc w:val="right"/>
+            </w:pPr>
+            <w:r>
+              <w:rPr>
+                <w:sz w:val="18"/>
+              </w:rPr>
+              <w:t>sourced</w:t>
+            </w:r>
+          </w:p>
+        </w:tc>
+        <w:tc>
+          <w:tcPr>
+            <w:tcW w:type="dxa" w:w="3742"/>
+          </w:tcPr>
+          <w:p>
+            <w:pPr>
+              <w:jc w:val="right"/>
+            </w:pPr>
+            <w:r>
+              <w:rPr>
+                <w:sz w:val="18"/>
+              </w:rPr>
+              <w:t>JICA / TEPSCO / KPMG, Data Collection Survey on Power Sector in Tunisia, Final Report (Mar 2022), p.2-2</w:t>
+            </w:r>
+          </w:p>
+        </w:tc>
+      </w:tr>
+      <w:tr>
+        <w:tc>
+          <w:tcPr>
+            <w:tcW w:type="dxa" w:w="2381"/>
+          </w:tcPr>
+          <w:p>
+            <w:r>
+              <w:rPr>
+                <w:sz w:val="18"/>
+              </w:rPr>
+              <w:t>gas_supply_domestic_2023_ktep</w:t>
+            </w:r>
+          </w:p>
+        </w:tc>
+        <w:tc>
+          <w:tcPr>
+            <w:tcW w:type="dxa" w:w="1020"/>
+          </w:tcPr>
+          <w:p>
+            <w:pPr>
+              <w:jc w:val="right"/>
+            </w:pPr>
+            <w:r>
+              <w:rPr>
+                <w:sz w:val="18"/>
+              </w:rPr>
+              <w:t>1,607</w:t>
+            </w:r>
+          </w:p>
+        </w:tc>
+        <w:tc>
+          <w:tcPr>
+            <w:tcW w:type="dxa" w:w="1134"/>
+          </w:tcPr>
+          <w:p>
+            <w:pPr>
+              <w:jc w:val="right"/>
+            </w:pPr>
+            <w:r>
+              <w:rPr>
+                <w:sz w:val="18"/>
+              </w:rPr>
+              <w:t>ktep (net CV)</w:t>
+            </w:r>
+          </w:p>
+        </w:tc>
+        <w:tc>
+          <w:tcPr>
+            <w:tcW w:type="dxa" w:w="1020"/>
+          </w:tcPr>
+          <w:p>
+            <w:pPr>
+              <w:jc w:val="right"/>
+            </w:pPr>
+            <w:r>
+              <w:rPr>
+                <w:sz w:val="18"/>
+              </w:rPr>
+              <w:t>sourced</w:t>
+            </w:r>
+          </w:p>
+        </w:tc>
+        <w:tc>
+          <w:tcPr>
+            <w:tcW w:type="dxa" w:w="3742"/>
+          </w:tcPr>
+          <w:p>
+            <w:pPr>
+              <w:jc w:val="right"/>
+            </w:pPr>
+            <w:r>
+              <w:rPr>
+                <w:sz w:val="18"/>
+              </w:rPr>
+              <w:t>ONEM / Ministry of Industry, Mines and Energy, Memento du secteur de l'énergie, Chiffres de 2024 (Aug 2025), table 'Gaz naturel' (approvisionnement, ktep-pci)</w:t>
             </w:r>
           </w:p>
         </w:tc>

</xml_diff>

<commit_message>
feat: run the 2027-2030 pathway and tell it in the docs, report, deck and site
All 11 scenarios now also run year by year from 2027 to 2030, building at
Tunisia's demonstrated pace (268 MW of solar a year, wind from 2029,
batteries from 2029). Renewables reach 22% in 2030 (27% when saving 15%),
so the 35% target is out of reach; each MWh saved over 2027-2030 avoids
70 EUR, 1.95 MWh of gas and 0.39 t of CO2, about twice the gas and CO2 of
the unconstrained 2030 run.

- results: pathway_summary.csv, pathway_avoided.csv, per-year warnings
- figures 10-12: share by year, capacity by year, avoided per year
- docs: Phase 6 write-up, README section, learning path 4-6, glossary
- report section 3.4 and a deck slide; site chapter "To 2030"
- 2030 runs re-run with Voltalia Gabes committed: only "new solar"
  moves (132 MW now counted as committed)
- toy end-to-end pathway test (112 tests, 98% coverage); build_year gains
  calibrate=False for the toy, the real runs are unchanged
</commit_message>
<xml_diff>
--- a/report/report.docx
+++ b/report/report.docx
@@ -20,7 +20,7 @@
         <w:rPr>
           <w:sz w:val="18"/>
         </w:rPr>
-        <w:t>Model: PyPSA-Earth v0.10.0 with the study code in this repository. All result numbers come from results/summary.csv, results/avoided.csv and results/validation.csv; all inputs come from data/assumptions_register.xlsx.</w:t>
+        <w:t>Model: PyPSA-Earth v0.10.0 with the study code in this repository. All result numbers come from results/summary.csv, results/avoided.csv, results/pathway_*.csv and results/validation.csv; all inputs come from data/assumptions_register.xlsx.</w:t>
       </w:r>
     </w:p>
     <w:p>
@@ -243,6 +243,14 @@
       </w:pPr>
       <w:r>
         <w:t>At the base gas price the least-cost system reaches 56% renewables, so the 35% target does not bind. It binds only in G-lo-S0, G-lo-S1-15.</w:t>
+      </w:r>
+    </w:p>
+    <w:p>
+      <w:pPr>
+        <w:pStyle w:val="ListBullet"/>
+      </w:pPr>
+      <w:r>
+        <w:t>Built year by year at Tunisia's demonstrated pace (2027-2030 pathway), renewables reach only 22% in 2030 (27% with the 15% saving), and each MWh saved avoids 0.39 t of CO2 and 70 EUR.</w:t>
       </w:r>
     </w:p>
     <w:p>
@@ -1397,7 +1405,7 @@
               <w:rPr>
                 <w:sz w:val="18"/>
               </w:rPr>
-              <w:t>3,929</w:t>
+              <w:t>3,797</w:t>
             </w:r>
           </w:p>
         </w:tc>
@@ -1413,7 +1421,7 @@
               <w:rPr>
                 <w:sz w:val="18"/>
               </w:rPr>
-              <w:t>3,237</w:t>
+              <w:t>3,105</w:t>
             </w:r>
           </w:p>
         </w:tc>
@@ -1429,7 +1437,7 @@
               <w:rPr>
                 <w:sz w:val="18"/>
               </w:rPr>
-              <w:t>2,928</w:t>
+              <w:t>2,796</w:t>
             </w:r>
           </w:p>
         </w:tc>
@@ -1445,7 +1453,7 @@
               <w:rPr>
                 <w:sz w:val="18"/>
               </w:rPr>
-              <w:t>2,606</w:t>
+              <w:t>2,474</w:t>
             </w:r>
           </w:p>
         </w:tc>
@@ -1461,7 +1469,7 @@
               <w:rPr>
                 <w:sz w:val="18"/>
               </w:rPr>
-              <w:t>2,802</w:t>
+              <w:t>2,670</w:t>
             </w:r>
           </w:p>
         </w:tc>
@@ -1477,7 +1485,7 @@
               <w:rPr>
                 <w:sz w:val="18"/>
               </w:rPr>
-              <w:t>3,453</w:t>
+              <w:t>3,321</w:t>
             </w:r>
           </w:p>
         </w:tc>
@@ -1493,7 +1501,7 @@
               <w:rPr>
                 <w:sz w:val="18"/>
               </w:rPr>
-              <w:t>3,948</w:t>
+              <w:t>3,816</w:t>
             </w:r>
           </w:p>
         </w:tc>
@@ -3493,6 +3501,614 @@
     </w:p>
     <w:p>
       <w:pPr>
+        <w:pStyle w:val="Heading2"/>
+      </w:pPr>
+      <w:r>
+        <w:t>3.4 The 2027-2030 pathway</w:t>
+      </w:r>
+    </w:p>
+    <w:p>
+      <w:r>
+        <w:t>The runs above solve 2030 in one step and may build any amount. The pathway instead solves 2025 and 2026 once (base case), then each scenario for 2027, 2028, 2029 and 2030 in turn. Each year keeps what was built before, committed projects switch on in their expected year, and new building is capped at Tunisia's demonstrated pace: 268 MW of solar a year beyond the committed projects, no new wind before 2029 and then 75 MW a year, and batteries only from 2029 (at most 150 MW / 540 MWh). Savings and shifting reach their full size in 2030, a quarter at a time from 2027. The 35% target is measured, not enforced.</w:t>
+      </w:r>
+    </w:p>
+    <w:tbl>
+      <w:tblPr>
+        <w:tblStyle w:val="TableGrid"/>
+        <w:tblW w:type="auto" w:w="0"/>
+        <w:jc w:val="center"/>
+        <w:tblLook w:firstColumn="1" w:firstRow="1" w:lastColumn="0" w:lastRow="0" w:noHBand="0" w:noVBand="1" w:val="04A0"/>
+      </w:tblPr>
+      <w:tblGrid>
+        <w:gridCol w:w="2436"/>
+        <w:gridCol w:w="2436"/>
+        <w:gridCol w:w="2436"/>
+        <w:gridCol w:w="2436"/>
+      </w:tblGrid>
+      <w:tr>
+        <w:tc>
+          <w:tcPr>
+            <w:tcW w:type="dxa" w:w="3402"/>
+          </w:tcPr>
+          <w:p>
+            <w:r>
+              <w:rPr>
+                <w:sz w:val="18"/>
+              </w:rPr>
+            </w:r>
+            <w:r>
+              <w:rPr>
+                <w:b/>
+                <w:sz w:val="18"/>
+              </w:rPr>
+              <w:t>Over 2027-2030, per MWh saved</w:t>
+            </w:r>
+          </w:p>
+        </w:tc>
+        <w:tc>
+          <w:tcPr>
+            <w:tcW w:type="dxa" w:w="1701"/>
+          </w:tcPr>
+          <w:p>
+            <w:r>
+              <w:rPr>
+                <w:sz w:val="18"/>
+              </w:rPr>
+            </w:r>
+            <w:r>
+              <w:rPr>
+                <w:b/>
+                <w:sz w:val="18"/>
+              </w:rPr>
+              <w:t>Cost (EUR)</w:t>
+            </w:r>
+          </w:p>
+        </w:tc>
+        <w:tc>
+          <w:tcPr>
+            <w:tcW w:type="dxa" w:w="1701"/>
+          </w:tcPr>
+          <w:p>
+            <w:r>
+              <w:rPr>
+                <w:sz w:val="18"/>
+              </w:rPr>
+            </w:r>
+            <w:r>
+              <w:rPr>
+                <w:b/>
+                <w:sz w:val="18"/>
+              </w:rPr>
+              <w:t>CO2 (t)</w:t>
+            </w:r>
+          </w:p>
+        </w:tc>
+        <w:tc>
+          <w:tcPr>
+            <w:tcW w:type="dxa" w:w="1701"/>
+          </w:tcPr>
+          <w:p>
+            <w:r>
+              <w:rPr>
+                <w:sz w:val="18"/>
+              </w:rPr>
+            </w:r>
+            <w:r>
+              <w:rPr>
+                <w:b/>
+                <w:sz w:val="18"/>
+              </w:rPr>
+              <w:t>Gas (MWh)</w:t>
+            </w:r>
+          </w:p>
+        </w:tc>
+      </w:tr>
+      <w:tr>
+        <w:tc>
+          <w:tcPr>
+            <w:tcW w:type="dxa" w:w="3402"/>
+          </w:tcPr>
+          <w:p>
+            <w:r>
+              <w:rPr>
+                <w:sz w:val="18"/>
+              </w:rPr>
+              <w:t>S1-10 vs S0</w:t>
+            </w:r>
+          </w:p>
+        </w:tc>
+        <w:tc>
+          <w:tcPr>
+            <w:tcW w:type="dxa" w:w="1701"/>
+          </w:tcPr>
+          <w:p>
+            <w:pPr>
+              <w:jc w:val="right"/>
+            </w:pPr>
+            <w:r>
+              <w:rPr>
+                <w:sz w:val="18"/>
+              </w:rPr>
+              <w:t>71.1</w:t>
+            </w:r>
+          </w:p>
+        </w:tc>
+        <w:tc>
+          <w:tcPr>
+            <w:tcW w:type="dxa" w:w="1701"/>
+          </w:tcPr>
+          <w:p>
+            <w:pPr>
+              <w:jc w:val="right"/>
+            </w:pPr>
+            <w:r>
+              <w:rPr>
+                <w:sz w:val="18"/>
+              </w:rPr>
+              <w:t>0.36</w:t>
+            </w:r>
+          </w:p>
+        </w:tc>
+        <w:tc>
+          <w:tcPr>
+            <w:tcW w:type="dxa" w:w="1701"/>
+          </w:tcPr>
+          <w:p>
+            <w:pPr>
+              <w:jc w:val="right"/>
+            </w:pPr>
+            <w:r>
+              <w:rPr>
+                <w:sz w:val="18"/>
+              </w:rPr>
+              <w:t>1.83</w:t>
+            </w:r>
+          </w:p>
+        </w:tc>
+      </w:tr>
+      <w:tr>
+        <w:tc>
+          <w:tcPr>
+            <w:tcW w:type="dxa" w:w="3402"/>
+          </w:tcPr>
+          <w:p>
+            <w:r>
+              <w:rPr>
+                <w:sz w:val="18"/>
+              </w:rPr>
+              <w:t>S1-15 vs S0</w:t>
+            </w:r>
+          </w:p>
+        </w:tc>
+        <w:tc>
+          <w:tcPr>
+            <w:tcW w:type="dxa" w:w="1701"/>
+          </w:tcPr>
+          <w:p>
+            <w:pPr>
+              <w:jc w:val="right"/>
+            </w:pPr>
+            <w:r>
+              <w:rPr>
+                <w:sz w:val="18"/>
+              </w:rPr>
+              <w:t>70.1</w:t>
+            </w:r>
+          </w:p>
+        </w:tc>
+        <w:tc>
+          <w:tcPr>
+            <w:tcW w:type="dxa" w:w="1701"/>
+          </w:tcPr>
+          <w:p>
+            <w:pPr>
+              <w:jc w:val="right"/>
+            </w:pPr>
+            <w:r>
+              <w:rPr>
+                <w:sz w:val="18"/>
+              </w:rPr>
+              <w:t>0.39</w:t>
+            </w:r>
+          </w:p>
+        </w:tc>
+        <w:tc>
+          <w:tcPr>
+            <w:tcW w:type="dxa" w:w="1701"/>
+          </w:tcPr>
+          <w:p>
+            <w:pPr>
+              <w:jc w:val="right"/>
+            </w:pPr>
+            <w:r>
+              <w:rPr>
+                <w:sz w:val="18"/>
+              </w:rPr>
+              <w:t>1.95</w:t>
+            </w:r>
+          </w:p>
+        </w:tc>
+      </w:tr>
+      <w:tr>
+        <w:tc>
+          <w:tcPr>
+            <w:tcW w:type="dxa" w:w="3402"/>
+          </w:tcPr>
+          <w:p>
+            <w:r>
+              <w:rPr>
+                <w:sz w:val="18"/>
+              </w:rPr>
+              <w:t>S1-20 vs S0</w:t>
+            </w:r>
+          </w:p>
+        </w:tc>
+        <w:tc>
+          <w:tcPr>
+            <w:tcW w:type="dxa" w:w="1701"/>
+          </w:tcPr>
+          <w:p>
+            <w:pPr>
+              <w:jc w:val="right"/>
+            </w:pPr>
+            <w:r>
+              <w:rPr>
+                <w:sz w:val="18"/>
+              </w:rPr>
+              <w:t>69.3</w:t>
+            </w:r>
+          </w:p>
+        </w:tc>
+        <w:tc>
+          <w:tcPr>
+            <w:tcW w:type="dxa" w:w="1701"/>
+          </w:tcPr>
+          <w:p>
+            <w:pPr>
+              <w:jc w:val="right"/>
+            </w:pPr>
+            <w:r>
+              <w:rPr>
+                <w:sz w:val="18"/>
+              </w:rPr>
+              <w:t>0.40</w:t>
+            </w:r>
+          </w:p>
+        </w:tc>
+        <w:tc>
+          <w:tcPr>
+            <w:tcW w:type="dxa" w:w="1701"/>
+          </w:tcPr>
+          <w:p>
+            <w:pPr>
+              <w:jc w:val="right"/>
+            </w:pPr>
+            <w:r>
+              <w:rPr>
+                <w:sz w:val="18"/>
+              </w:rPr>
+              <w:t>2.00</w:t>
+            </w:r>
+          </w:p>
+        </w:tc>
+      </w:tr>
+      <w:tr>
+        <w:tc>
+          <w:tcPr>
+            <w:tcW w:type="dxa" w:w="3402"/>
+          </w:tcPr>
+          <w:p>
+            <w:r>
+              <w:rPr>
+                <w:sz w:val="18"/>
+              </w:rPr>
+              <w:t>S2-300 vs S0</w:t>
+            </w:r>
+          </w:p>
+        </w:tc>
+        <w:tc>
+          <w:tcPr>
+            <w:tcW w:type="dxa" w:w="1701"/>
+          </w:tcPr>
+          <w:p>
+            <w:pPr>
+              <w:jc w:val="right"/>
+            </w:pPr>
+            <w:r>
+              <w:rPr>
+                <w:sz w:val="18"/>
+              </w:rPr>
+              <w:t>72.0</w:t>
+            </w:r>
+          </w:p>
+        </w:tc>
+        <w:tc>
+          <w:tcPr>
+            <w:tcW w:type="dxa" w:w="1701"/>
+          </w:tcPr>
+          <w:p>
+            <w:pPr>
+              <w:jc w:val="right"/>
+            </w:pPr>
+            <w:r>
+              <w:rPr>
+                <w:sz w:val="18"/>
+              </w:rPr>
+              <w:t>0.40</w:t>
+            </w:r>
+          </w:p>
+        </w:tc>
+        <w:tc>
+          <w:tcPr>
+            <w:tcW w:type="dxa" w:w="1701"/>
+          </w:tcPr>
+          <w:p>
+            <w:pPr>
+              <w:jc w:val="right"/>
+            </w:pPr>
+            <w:r>
+              <w:rPr>
+                <w:sz w:val="18"/>
+              </w:rPr>
+              <w:t>2.02</w:t>
+            </w:r>
+          </w:p>
+        </w:tc>
+      </w:tr>
+      <w:tr>
+        <w:tc>
+          <w:tcPr>
+            <w:tcW w:type="dxa" w:w="3402"/>
+          </w:tcPr>
+          <w:p>
+            <w:r>
+              <w:rPr>
+                <w:sz w:val="18"/>
+              </w:rPr>
+              <w:t>G-lo-S1-15 vs G-lo-S0</w:t>
+            </w:r>
+          </w:p>
+        </w:tc>
+        <w:tc>
+          <w:tcPr>
+            <w:tcW w:type="dxa" w:w="1701"/>
+          </w:tcPr>
+          <w:p>
+            <w:pPr>
+              <w:jc w:val="right"/>
+            </w:pPr>
+            <w:r>
+              <w:rPr>
+                <w:sz w:val="18"/>
+              </w:rPr>
+              <w:t>40.9</w:t>
+            </w:r>
+          </w:p>
+        </w:tc>
+        <w:tc>
+          <w:tcPr>
+            <w:tcW w:type="dxa" w:w="1701"/>
+          </w:tcPr>
+          <w:p>
+            <w:pPr>
+              <w:jc w:val="right"/>
+            </w:pPr>
+            <w:r>
+              <w:rPr>
+                <w:sz w:val="18"/>
+              </w:rPr>
+              <w:t>0.43</w:t>
+            </w:r>
+          </w:p>
+        </w:tc>
+        <w:tc>
+          <w:tcPr>
+            <w:tcW w:type="dxa" w:w="1701"/>
+          </w:tcPr>
+          <w:p>
+            <w:pPr>
+              <w:jc w:val="right"/>
+            </w:pPr>
+            <w:r>
+              <w:rPr>
+                <w:sz w:val="18"/>
+              </w:rPr>
+              <w:t>2.19</w:t>
+            </w:r>
+          </w:p>
+        </w:tc>
+      </w:tr>
+      <w:tr>
+        <w:tc>
+          <w:tcPr>
+            <w:tcW w:type="dxa" w:w="3402"/>
+          </w:tcPr>
+          <w:p>
+            <w:r>
+              <w:rPr>
+                <w:sz w:val="18"/>
+              </w:rPr>
+              <w:t>G-hi-S1-15 vs G-hi-S0</w:t>
+            </w:r>
+          </w:p>
+        </w:tc>
+        <w:tc>
+          <w:tcPr>
+            <w:tcW w:type="dxa" w:w="1701"/>
+          </w:tcPr>
+          <w:p>
+            <w:pPr>
+              <w:jc w:val="right"/>
+            </w:pPr>
+            <w:r>
+              <w:rPr>
+                <w:sz w:val="18"/>
+              </w:rPr>
+              <w:t>95.2</w:t>
+            </w:r>
+          </w:p>
+        </w:tc>
+        <w:tc>
+          <w:tcPr>
+            <w:tcW w:type="dxa" w:w="1701"/>
+          </w:tcPr>
+          <w:p>
+            <w:pPr>
+              <w:jc w:val="right"/>
+            </w:pPr>
+            <w:r>
+              <w:rPr>
+                <w:sz w:val="18"/>
+              </w:rPr>
+              <w:t>0.36</w:t>
+            </w:r>
+          </w:p>
+        </w:tc>
+        <w:tc>
+          <w:tcPr>
+            <w:tcW w:type="dxa" w:w="1701"/>
+          </w:tcPr>
+          <w:p>
+            <w:pPr>
+              <w:jc w:val="right"/>
+            </w:pPr>
+            <w:r>
+              <w:rPr>
+                <w:sz w:val="18"/>
+              </w:rPr>
+              <w:t>1.80</w:t>
+            </w:r>
+          </w:p>
+        </w:tc>
+      </w:tr>
+    </w:tbl>
+    <w:p/>
+    <w:p>
+      <w:pPr>
+        <w:pStyle w:val="ListBullet"/>
+      </w:pPr>
+      <w:r>
+        <w:t>Renewables reach 22% of generation in 2030 without extra saving, 27% when saving 15% and 29% when saving 20%: the 35% target is out of reach at this pace, and efficiency closes part of the gap.</w:t>
+      </w:r>
+    </w:p>
+    <w:p>
+      <w:pPr>
+        <w:pStyle w:val="ListBullet"/>
+      </w:pPr>
+      <w:r>
+        <w:t>Each MWh saved (S1-15) avoids 0.39 t of CO2 and 1.95 MWh of gas, against 0.18 t and 0.91 MWh in the unconstrained 2030 run: with little room to build solar, a saved MWh comes off a gas plant.</w:t>
+      </w:r>
+    </w:p>
+    <w:p>
+      <w:pPr>
+        <w:pStyle w:val="ListBullet"/>
+      </w:pPr>
+      <w:r>
+        <w:t>Without extra saving the model adds 423 MW of combined cycles by 2030 for the reserve margin; every saving scenario adds none.</w:t>
+      </w:r>
+    </w:p>
+    <w:p>
+      <w:pPr>
+        <w:pStyle w:val="ListBullet"/>
+      </w:pPr>
+      <w:r>
+        <w:t>Shifting 300 MW is worth 6.8 M EUR in 2030, much less than in the unconstrained run, because there is little midday solar to shift into.</w:t>
+      </w:r>
+    </w:p>
+    <w:p>
+      <w:r>
+        <w:drawing>
+          <wp:inline xmlns:a="http://schemas.openxmlformats.org/drawingml/2006/main" xmlns:pic="http://schemas.openxmlformats.org/drawingml/2006/picture">
+            <wp:extent cx="5760000" cy="2764800"/>
+            <wp:docPr id="7" name="Picture 7"/>
+            <wp:cNvGraphicFramePr>
+              <a:graphicFrameLocks noChangeAspect="1"/>
+            </wp:cNvGraphicFramePr>
+            <a:graphic>
+              <a:graphicData uri="http://schemas.openxmlformats.org/drawingml/2006/picture">
+                <pic:pic>
+                  <pic:nvPicPr>
+                    <pic:cNvPr id="0" name="10_pathway_res_share.png"/>
+                    <pic:cNvPicPr/>
+                  </pic:nvPicPr>
+                  <pic:blipFill>
+                    <a:blip r:embed="rId15"/>
+                    <a:stretch>
+                      <a:fillRect/>
+                    </a:stretch>
+                  </pic:blipFill>
+                  <pic:spPr>
+                    <a:xfrm>
+                      <a:off x="0" y="0"/>
+                      <a:ext cx="5760000" cy="2764800"/>
+                    </a:xfrm>
+                    <a:prstGeom prst="rect"/>
+                  </pic:spPr>
+                </pic:pic>
+              </a:graphicData>
+            </a:graphic>
+          </wp:inline>
+        </w:drawing>
+      </w:r>
+    </w:p>
+    <w:p>
+      <w:r>
+        <w:rPr>
+          <w:i/>
+          <w:color w:val="52514E"/>
+          <w:sz w:val="18"/>
+        </w:rPr>
+        <w:t>Figure 7. Renewable share year by year on the pathway, against the target.</w:t>
+      </w:r>
+    </w:p>
+    <w:p>
+      <w:r>
+        <w:drawing>
+          <wp:inline xmlns:a="http://schemas.openxmlformats.org/drawingml/2006/main" xmlns:pic="http://schemas.openxmlformats.org/drawingml/2006/picture">
+            <wp:extent cx="5760000" cy="2016000"/>
+            <wp:docPr id="8" name="Picture 8"/>
+            <wp:cNvGraphicFramePr>
+              <a:graphicFrameLocks noChangeAspect="1"/>
+            </wp:cNvGraphicFramePr>
+            <a:graphic>
+              <a:graphicData uri="http://schemas.openxmlformats.org/drawingml/2006/picture">
+                <pic:pic>
+                  <pic:nvPicPr>
+                    <pic:cNvPr id="0" name="12_pathway_avoided.png"/>
+                    <pic:cNvPicPr/>
+                  </pic:nvPicPr>
+                  <pic:blipFill>
+                    <a:blip r:embed="rId16"/>
+                    <a:stretch>
+                      <a:fillRect/>
+                    </a:stretch>
+                  </pic:blipFill>
+                  <pic:spPr>
+                    <a:xfrm>
+                      <a:off x="0" y="0"/>
+                      <a:ext cx="5760000" cy="2016000"/>
+                    </a:xfrm>
+                    <a:prstGeom prst="rect"/>
+                  </pic:spPr>
+                </pic:pic>
+              </a:graphicData>
+            </a:graphic>
+          </wp:inline>
+        </w:drawing>
+      </w:r>
+    </w:p>
+    <w:p>
+      <w:r>
+        <w:rPr>
+          <w:i/>
+          <w:color w:val="52514E"/>
+          <w:sz w:val="18"/>
+        </w:rPr>
+        <w:t>Figure 8. What each MWh saved avoids, year by year (S1-15 vs S0), against the unconstrained 2030 run (dashed).</w:t>
+      </w:r>
+    </w:p>
+    <w:p>
+      <w:pPr>
         <w:pStyle w:val="Heading1"/>
       </w:pPr>
       <w:r>
@@ -3504,7 +4120,7 @@
         <w:pStyle w:val="ListBullet"/>
       </w:pPr>
       <w:r>
-        <w:t>Nothing limits how fast renewables are built. The base case adds 6.0 GW of solar and wind by 2030, far above Tunisia's recent pace. The results show what least cost would do, not a forecast.</w:t>
+        <w:t>In the 2030 runs nothing limits how fast renewables are built: the base case adds 5.9 GW of solar and wind, far above Tunisia's recent pace. The pathway (section 3.4) caps building; its caps are judgements based on past pace, and it assumes committed projects arrive on time.</w:t>
       </w:r>
     </w:p>
     <w:p>
@@ -7870,6 +8486,715 @@
           </w:p>
         </w:tc>
       </w:tr>
+      <w:tr>
+        <w:tc>
+          <w:tcPr>
+            <w:tcW w:type="dxa" w:w="2381"/>
+          </w:tcPr>
+          <w:p>
+            <w:r>
+              <w:rPr>
+                <w:sz w:val="18"/>
+              </w:rPr>
+              <w:t>solar_capacity_2024_mw</w:t>
+            </w:r>
+          </w:p>
+        </w:tc>
+        <w:tc>
+          <w:tcPr>
+            <w:tcW w:type="dxa" w:w="1020"/>
+          </w:tcPr>
+          <w:p>
+            <w:pPr>
+              <w:jc w:val="right"/>
+            </w:pPr>
+            <w:r>
+              <w:rPr>
+                <w:sz w:val="18"/>
+              </w:rPr>
+              <w:t>773</w:t>
+            </w:r>
+          </w:p>
+        </w:tc>
+        <w:tc>
+          <w:tcPr>
+            <w:tcW w:type="dxa" w:w="1134"/>
+          </w:tcPr>
+          <w:p>
+            <w:pPr>
+              <w:jc w:val="right"/>
+            </w:pPr>
+            <w:r>
+              <w:rPr>
+                <w:sz w:val="18"/>
+              </w:rPr>
+              <w:t>MW</w:t>
+            </w:r>
+          </w:p>
+        </w:tc>
+        <w:tc>
+          <w:tcPr>
+            <w:tcW w:type="dxa" w:w="1020"/>
+          </w:tcPr>
+          <w:p>
+            <w:pPr>
+              <w:jc w:val="right"/>
+            </w:pPr>
+            <w:r>
+              <w:rPr>
+                <w:sz w:val="18"/>
+              </w:rPr>
+              <w:t>sourced</w:t>
+            </w:r>
+          </w:p>
+        </w:tc>
+        <w:tc>
+          <w:tcPr>
+            <w:tcW w:type="dxa" w:w="3742"/>
+          </w:tcPr>
+          <w:p>
+            <w:pPr>
+              <w:jc w:val="right"/>
+            </w:pPr>
+            <w:r>
+              <w:rPr>
+                <w:sz w:val="18"/>
+              </w:rPr>
+              <w:t>Enerdata, 'France's Voltalia expands Tunisian portfolio with 132 MW solar project' (4 Feb 2026)</w:t>
+            </w:r>
+          </w:p>
+        </w:tc>
+      </w:tr>
+      <w:tr>
+        <w:tc>
+          <w:tcPr>
+            <w:tcW w:type="dxa" w:w="2381"/>
+          </w:tcPr>
+          <w:p>
+            <w:r>
+              <w:rPr>
+                <w:sz w:val="18"/>
+              </w:rPr>
+              <w:t>solar_growth_2024</w:t>
+            </w:r>
+          </w:p>
+        </w:tc>
+        <w:tc>
+          <w:tcPr>
+            <w:tcW w:type="dxa" w:w="1020"/>
+          </w:tcPr>
+          <w:p>
+            <w:pPr>
+              <w:jc w:val="right"/>
+            </w:pPr>
+            <w:r>
+              <w:rPr>
+                <w:sz w:val="18"/>
+              </w:rPr>
+              <w:t>0.53</w:t>
+            </w:r>
+          </w:p>
+        </w:tc>
+        <w:tc>
+          <w:tcPr>
+            <w:tcW w:type="dxa" w:w="1134"/>
+          </w:tcPr>
+          <w:p>
+            <w:pPr>
+              <w:jc w:val="right"/>
+            </w:pPr>
+            <w:r>
+              <w:rPr>
+                <w:sz w:val="18"/>
+              </w:rPr>
+              <w:t>share</w:t>
+            </w:r>
+          </w:p>
+        </w:tc>
+        <w:tc>
+          <w:tcPr>
+            <w:tcW w:type="dxa" w:w="1020"/>
+          </w:tcPr>
+          <w:p>
+            <w:pPr>
+              <w:jc w:val="right"/>
+            </w:pPr>
+            <w:r>
+              <w:rPr>
+                <w:sz w:val="18"/>
+              </w:rPr>
+              <w:t>sourced</w:t>
+            </w:r>
+          </w:p>
+        </w:tc>
+        <w:tc>
+          <w:tcPr>
+            <w:tcW w:type="dxa" w:w="3742"/>
+          </w:tcPr>
+          <w:p>
+            <w:pPr>
+              <w:jc w:val="right"/>
+            </w:pPr>
+            <w:r>
+              <w:rPr>
+                <w:sz w:val="18"/>
+              </w:rPr>
+              <w:t>Enerdata, 'France's Voltalia expands Tunisian portfolio with 132 MW solar project' (4 Feb 2026)</w:t>
+            </w:r>
+          </w:p>
+        </w:tc>
+      </w:tr>
+      <w:tr>
+        <w:tc>
+          <w:tcPr>
+            <w:tcW w:type="dxa" w:w="2381"/>
+          </w:tcPr>
+          <w:p>
+            <w:r>
+              <w:rPr>
+                <w:sz w:val="18"/>
+              </w:rPr>
+              <w:t>pathway_solar_extra_mw_per_year</w:t>
+            </w:r>
+          </w:p>
+        </w:tc>
+        <w:tc>
+          <w:tcPr>
+            <w:tcW w:type="dxa" w:w="1020"/>
+          </w:tcPr>
+          <w:p>
+            <w:pPr>
+              <w:jc w:val="right"/>
+            </w:pPr>
+            <w:r>
+              <w:rPr>
+                <w:sz w:val="18"/>
+              </w:rPr>
+              <w:t>268</w:t>
+            </w:r>
+          </w:p>
+        </w:tc>
+        <w:tc>
+          <w:tcPr>
+            <w:tcW w:type="dxa" w:w="1134"/>
+          </w:tcPr>
+          <w:p>
+            <w:pPr>
+              <w:jc w:val="right"/>
+            </w:pPr>
+            <w:r>
+              <w:rPr>
+                <w:sz w:val="18"/>
+              </w:rPr>
+              <w:t>MW/yr</w:t>
+            </w:r>
+          </w:p>
+        </w:tc>
+        <w:tc>
+          <w:tcPr>
+            <w:tcW w:type="dxa" w:w="1020"/>
+          </w:tcPr>
+          <w:p>
+            <w:pPr>
+              <w:jc w:val="right"/>
+            </w:pPr>
+            <w:r>
+              <w:rPr>
+                <w:sz w:val="18"/>
+              </w:rPr>
+              <w:t>assumption</w:t>
+            </w:r>
+          </w:p>
+        </w:tc>
+        <w:tc>
+          <w:tcPr>
+            <w:tcW w:type="dxa" w:w="3742"/>
+          </w:tcPr>
+          <w:p>
+            <w:pPr>
+              <w:jc w:val="right"/>
+            </w:pPr>
+            <w:r>
+              <w:rPr>
+                <w:sz w:val="18"/>
+              </w:rPr>
+            </w:r>
+          </w:p>
+        </w:tc>
+      </w:tr>
+      <w:tr>
+        <w:tc>
+          <w:tcPr>
+            <w:tcW w:type="dxa" w:w="2381"/>
+          </w:tcPr>
+          <w:p>
+            <w:r>
+              <w:rPr>
+                <w:sz w:val="18"/>
+              </w:rPr>
+              <w:t>pathway_wind_first_year</w:t>
+            </w:r>
+          </w:p>
+        </w:tc>
+        <w:tc>
+          <w:tcPr>
+            <w:tcW w:type="dxa" w:w="1020"/>
+          </w:tcPr>
+          <w:p>
+            <w:pPr>
+              <w:jc w:val="right"/>
+            </w:pPr>
+            <w:r>
+              <w:rPr>
+                <w:sz w:val="18"/>
+              </w:rPr>
+              <w:t>2,029</w:t>
+            </w:r>
+          </w:p>
+        </w:tc>
+        <w:tc>
+          <w:tcPr>
+            <w:tcW w:type="dxa" w:w="1134"/>
+          </w:tcPr>
+          <w:p>
+            <w:pPr>
+              <w:jc w:val="right"/>
+            </w:pPr>
+            <w:r>
+              <w:rPr>
+                <w:sz w:val="18"/>
+              </w:rPr>
+              <w:t>year</w:t>
+            </w:r>
+          </w:p>
+        </w:tc>
+        <w:tc>
+          <w:tcPr>
+            <w:tcW w:type="dxa" w:w="1020"/>
+          </w:tcPr>
+          <w:p>
+            <w:pPr>
+              <w:jc w:val="right"/>
+            </w:pPr>
+            <w:r>
+              <w:rPr>
+                <w:sz w:val="18"/>
+              </w:rPr>
+              <w:t>assumption</w:t>
+            </w:r>
+          </w:p>
+        </w:tc>
+        <w:tc>
+          <w:tcPr>
+            <w:tcW w:type="dxa" w:w="3742"/>
+          </w:tcPr>
+          <w:p>
+            <w:pPr>
+              <w:jc w:val="right"/>
+            </w:pPr>
+            <w:r>
+              <w:rPr>
+                <w:sz w:val="18"/>
+              </w:rPr>
+            </w:r>
+          </w:p>
+        </w:tc>
+      </w:tr>
+      <w:tr>
+        <w:tc>
+          <w:tcPr>
+            <w:tcW w:type="dxa" w:w="2381"/>
+          </w:tcPr>
+          <w:p>
+            <w:r>
+              <w:rPr>
+                <w:sz w:val="18"/>
+              </w:rPr>
+              <w:t>pathway_wind_extra_mw_per_year</w:t>
+            </w:r>
+          </w:p>
+        </w:tc>
+        <w:tc>
+          <w:tcPr>
+            <w:tcW w:type="dxa" w:w="1020"/>
+          </w:tcPr>
+          <w:p>
+            <w:pPr>
+              <w:jc w:val="right"/>
+            </w:pPr>
+            <w:r>
+              <w:rPr>
+                <w:sz w:val="18"/>
+              </w:rPr>
+              <w:t>75</w:t>
+            </w:r>
+          </w:p>
+        </w:tc>
+        <w:tc>
+          <w:tcPr>
+            <w:tcW w:type="dxa" w:w="1134"/>
+          </w:tcPr>
+          <w:p>
+            <w:pPr>
+              <w:jc w:val="right"/>
+            </w:pPr>
+            <w:r>
+              <w:rPr>
+                <w:sz w:val="18"/>
+              </w:rPr>
+              <w:t>MW/yr</w:t>
+            </w:r>
+          </w:p>
+        </w:tc>
+        <w:tc>
+          <w:tcPr>
+            <w:tcW w:type="dxa" w:w="1020"/>
+          </w:tcPr>
+          <w:p>
+            <w:pPr>
+              <w:jc w:val="right"/>
+            </w:pPr>
+            <w:r>
+              <w:rPr>
+                <w:sz w:val="18"/>
+              </w:rPr>
+              <w:t>assumption</w:t>
+            </w:r>
+          </w:p>
+        </w:tc>
+        <w:tc>
+          <w:tcPr>
+            <w:tcW w:type="dxa" w:w="3742"/>
+          </w:tcPr>
+          <w:p>
+            <w:pPr>
+              <w:jc w:val="right"/>
+            </w:pPr>
+            <w:r>
+              <w:rPr>
+                <w:sz w:val="18"/>
+              </w:rPr>
+              <w:t>Enerdata, 'Tunisia launches a tender for 1.7 GW of renewables' (5 Jan 2023)</w:t>
+            </w:r>
+          </w:p>
+        </w:tc>
+      </w:tr>
+      <w:tr>
+        <w:tc>
+          <w:tcPr>
+            <w:tcW w:type="dxa" w:w="2381"/>
+          </w:tcPr>
+          <w:p>
+            <w:r>
+              <w:rPr>
+                <w:sz w:val="18"/>
+              </w:rPr>
+              <w:t>pathway_battery_first_year</w:t>
+            </w:r>
+          </w:p>
+        </w:tc>
+        <w:tc>
+          <w:tcPr>
+            <w:tcW w:type="dxa" w:w="1020"/>
+          </w:tcPr>
+          <w:p>
+            <w:pPr>
+              <w:jc w:val="right"/>
+            </w:pPr>
+            <w:r>
+              <w:rPr>
+                <w:sz w:val="18"/>
+              </w:rPr>
+              <w:t>2,029</w:t>
+            </w:r>
+          </w:p>
+        </w:tc>
+        <w:tc>
+          <w:tcPr>
+            <w:tcW w:type="dxa" w:w="1134"/>
+          </w:tcPr>
+          <w:p>
+            <w:pPr>
+              <w:jc w:val="right"/>
+            </w:pPr>
+            <w:r>
+              <w:rPr>
+                <w:sz w:val="18"/>
+              </w:rPr>
+              <w:t>year</w:t>
+            </w:r>
+          </w:p>
+        </w:tc>
+        <w:tc>
+          <w:tcPr>
+            <w:tcW w:type="dxa" w:w="1020"/>
+          </w:tcPr>
+          <w:p>
+            <w:pPr>
+              <w:jc w:val="right"/>
+            </w:pPr>
+            <w:r>
+              <w:rPr>
+                <w:sz w:val="18"/>
+              </w:rPr>
+              <w:t>assumption</w:t>
+            </w:r>
+          </w:p>
+        </w:tc>
+        <w:tc>
+          <w:tcPr>
+            <w:tcW w:type="dxa" w:w="3742"/>
+          </w:tcPr>
+          <w:p>
+            <w:pPr>
+              <w:jc w:val="right"/>
+            </w:pPr>
+            <w:r>
+              <w:rPr>
+                <w:sz w:val="18"/>
+              </w:rPr>
+              <w:t>Mercom, 'Tunisia invites bids for 300 MW solar plus 150 MW/540 MWh battery storage project' (Mar 2026)</w:t>
+            </w:r>
+          </w:p>
+        </w:tc>
+      </w:tr>
+      <w:tr>
+        <w:tc>
+          <w:tcPr>
+            <w:tcW w:type="dxa" w:w="2381"/>
+          </w:tcPr>
+          <w:p>
+            <w:r>
+              <w:rPr>
+                <w:sz w:val="18"/>
+              </w:rPr>
+              <w:t>pathway_battery_mw</w:t>
+            </w:r>
+          </w:p>
+        </w:tc>
+        <w:tc>
+          <w:tcPr>
+            <w:tcW w:type="dxa" w:w="1020"/>
+          </w:tcPr>
+          <w:p>
+            <w:pPr>
+              <w:jc w:val="right"/>
+            </w:pPr>
+            <w:r>
+              <w:rPr>
+                <w:sz w:val="18"/>
+              </w:rPr>
+              <w:t>150</w:t>
+            </w:r>
+          </w:p>
+        </w:tc>
+        <w:tc>
+          <w:tcPr>
+            <w:tcW w:type="dxa" w:w="1134"/>
+          </w:tcPr>
+          <w:p>
+            <w:pPr>
+              <w:jc w:val="right"/>
+            </w:pPr>
+            <w:r>
+              <w:rPr>
+                <w:sz w:val="18"/>
+              </w:rPr>
+              <w:t>MW</w:t>
+            </w:r>
+          </w:p>
+        </w:tc>
+        <w:tc>
+          <w:tcPr>
+            <w:tcW w:type="dxa" w:w="1020"/>
+          </w:tcPr>
+          <w:p>
+            <w:pPr>
+              <w:jc w:val="right"/>
+            </w:pPr>
+            <w:r>
+              <w:rPr>
+                <w:sz w:val="18"/>
+              </w:rPr>
+              <w:t>assumption</w:t>
+            </w:r>
+          </w:p>
+        </w:tc>
+        <w:tc>
+          <w:tcPr>
+            <w:tcW w:type="dxa" w:w="3742"/>
+          </w:tcPr>
+          <w:p>
+            <w:pPr>
+              <w:jc w:val="right"/>
+            </w:pPr>
+            <w:r>
+              <w:rPr>
+                <w:sz w:val="18"/>
+              </w:rPr>
+              <w:t>Mercom, 'Tunisia invites bids for 300 MW solar plus 150 MW/540 MWh battery storage project' (Mar 2026)</w:t>
+            </w:r>
+          </w:p>
+        </w:tc>
+      </w:tr>
+      <w:tr>
+        <w:tc>
+          <w:tcPr>
+            <w:tcW w:type="dxa" w:w="2381"/>
+          </w:tcPr>
+          <w:p>
+            <w:r>
+              <w:rPr>
+                <w:sz w:val="18"/>
+              </w:rPr>
+              <w:t>anme_demand_cut_2030</w:t>
+            </w:r>
+          </w:p>
+        </w:tc>
+        <w:tc>
+          <w:tcPr>
+            <w:tcW w:type="dxa" w:w="1020"/>
+          </w:tcPr>
+          <w:p>
+            <w:pPr>
+              <w:jc w:val="right"/>
+            </w:pPr>
+            <w:r>
+              <w:rPr>
+                <w:sz w:val="18"/>
+              </w:rPr>
+              <w:t>0.3</w:t>
+            </w:r>
+          </w:p>
+        </w:tc>
+        <w:tc>
+          <w:tcPr>
+            <w:tcW w:type="dxa" w:w="1134"/>
+          </w:tcPr>
+          <w:p>
+            <w:pPr>
+              <w:jc w:val="right"/>
+            </w:pPr>
+            <w:r>
+              <w:rPr>
+                <w:sz w:val="18"/>
+              </w:rPr>
+              <w:t>share</w:t>
+            </w:r>
+          </w:p>
+        </w:tc>
+        <w:tc>
+          <w:tcPr>
+            <w:tcW w:type="dxa" w:w="1020"/>
+          </w:tcPr>
+          <w:p>
+            <w:pPr>
+              <w:jc w:val="right"/>
+            </w:pPr>
+            <w:r>
+              <w:rPr>
+                <w:sz w:val="18"/>
+              </w:rPr>
+              <w:t>sourced</w:t>
+            </w:r>
+          </w:p>
+        </w:tc>
+        <w:tc>
+          <w:tcPr>
+            <w:tcW w:type="dxa" w:w="3742"/>
+          </w:tcPr>
+          <w:p>
+            <w:pPr>
+              <w:jc w:val="right"/>
+            </w:pPr>
+            <w:r>
+              <w:rPr>
+                <w:sz w:val="18"/>
+              </w:rPr>
+              <w:t>AllAfrica / La Presse, ANME announcement of the national energy-conservation strategy (24 Oct 2025)</w:t>
+            </w:r>
+          </w:p>
+        </w:tc>
+      </w:tr>
+      <w:tr>
+        <w:tc>
+          <w:tcPr>
+            <w:tcW w:type="dxa" w:w="2381"/>
+          </w:tcPr>
+          <w:p>
+            <w:r>
+              <w:rPr>
+                <w:sz w:val="18"/>
+              </w:rPr>
+              <w:t>pathway_battery_mwh</w:t>
+            </w:r>
+          </w:p>
+        </w:tc>
+        <w:tc>
+          <w:tcPr>
+            <w:tcW w:type="dxa" w:w="1020"/>
+          </w:tcPr>
+          <w:p>
+            <w:pPr>
+              <w:jc w:val="right"/>
+            </w:pPr>
+            <w:r>
+              <w:rPr>
+                <w:sz w:val="18"/>
+              </w:rPr>
+              <w:t>540</w:t>
+            </w:r>
+          </w:p>
+        </w:tc>
+        <w:tc>
+          <w:tcPr>
+            <w:tcW w:type="dxa" w:w="1134"/>
+          </w:tcPr>
+          <w:p>
+            <w:pPr>
+              <w:jc w:val="right"/>
+            </w:pPr>
+            <w:r>
+              <w:rPr>
+                <w:sz w:val="18"/>
+              </w:rPr>
+              <w:t>MWh</w:t>
+            </w:r>
+          </w:p>
+        </w:tc>
+        <w:tc>
+          <w:tcPr>
+            <w:tcW w:type="dxa" w:w="1020"/>
+          </w:tcPr>
+          <w:p>
+            <w:pPr>
+              <w:jc w:val="right"/>
+            </w:pPr>
+            <w:r>
+              <w:rPr>
+                <w:sz w:val="18"/>
+              </w:rPr>
+              <w:t>assumption</w:t>
+            </w:r>
+          </w:p>
+        </w:tc>
+        <w:tc>
+          <w:tcPr>
+            <w:tcW w:type="dxa" w:w="3742"/>
+          </w:tcPr>
+          <w:p>
+            <w:pPr>
+              <w:jc w:val="right"/>
+            </w:pPr>
+            <w:r>
+              <w:rPr>
+                <w:sz w:val="18"/>
+              </w:rPr>
+              <w:t>Mercom, 'Tunisia invites bids for 300 MW solar plus 150 MW/540 MWh battery storage project' (Mar 2026)</w:t>
+            </w:r>
+          </w:p>
+        </w:tc>
+      </w:tr>
     </w:tbl>
     <w:p/>
     <w:p>
@@ -7882,7 +9207,7 @@
     </w:p>
     <w:p>
       <w:r>
-        <w:t>The code, tests, scenario files and step-by-step instructions are in the repository README. One command (snakemake -j 1) rebuilds, solves and checks all 11 scenarios in about an hour on a laptop, and scripts/make_figures.py and scripts/make_report.py redraw the figures and this report.</w:t>
+        <w:t>The code, tests, scenario files and step-by-step instructions are in the repository README. One command (snakemake -j 1) rebuilds, solves and checks all 11 scenarios, for 2030 and for the 2027-2030 pathway, in about two hours on a laptop, and scripts/make_figures.py and scripts/make_report.py redraw the figures and this report.</w:t>
       </w:r>
     </w:p>
     <w:sectPr>

</xml_diff>